<commit_message>
Correct the obligation count: 5 / 3 / 2 / 14, not 7 / 4 / 2 / 11
The summary under the register did not match its own rows, and claim R18
was ticked without recounting. Recounted row by row; the classification of
each obligation is unchanged. Also fixes three leftover 'eleven brokers'
references (ten were checked). Both recorded in a new CORRECTIONS.md.
</commit_message>
<xml_diff>
--- a/guide/Investor_Accessibility_Guide_v1.docx
+++ b/guide/Investor_Accessibility_Guide_v1.docx
@@ -3838,7 +3838,7 @@
         <w:pStyle w:val="FirstParagraph"/>
       </w:pPr>
       <w:r>
-        <w:t xml:space="preserve">Break the circulars into their individual obligations — there are about two dozen — and sort them by whether anybody outside the firm could check them.</w:t>
+        <w:t xml:space="preserve">Break the circulars into their individual obligations — there are twenty-four — and sort them by whether anybody outside the firm could check them.</w:t>
       </w:r>
     </w:p>
     <w:p>
@@ -3850,7 +3850,7 @@
         </w:numPr>
       </w:pPr>
       <w:r>
-        <w:t xml:space="preserve">Roughly seven can be checked from published material.</w:t>
+        <w:t xml:space="preserve">Five can be checked from published material.</w:t>
       </w:r>
     </w:p>
     <w:p>
@@ -3862,7 +3862,7 @@
         </w:numPr>
       </w:pPr>
       <w:r>
-        <w:t xml:space="preserve">About four can be tested on the live app or website.</w:t>
+        <w:t xml:space="preserve">Three can be tested on the live app or website.</w:t>
       </w:r>
     </w:p>
     <w:p>
@@ -3890,7 +3890,7 @@
           <w:b/>
           <w:bCs/>
         </w:rPr>
-        <w:t xml:space="preserve">Around eleven cannot be observed from outside at all.</w:t>
+        <w:t xml:space="preserve">Fourteen cannot be observed from outside at all.</w:t>
       </w:r>
     </w:p>
     <w:p>
@@ -3898,7 +3898,7 @@
         <w:pStyle w:val="FirstParagraph"/>
       </w:pPr>
       <w:r>
-        <w:t xml:space="preserve">Nine of those eleven would become visible if a firm chose to publish. None is required to.</w:t>
+        <w:t xml:space="preserve">Seven of those fourteen would become visible if a firm chose to publish. None is required to.</w:t>
       </w:r>
     </w:p>
     <w:p>
@@ -4129,7 +4129,7 @@
         </w:numPr>
       </w:pPr>
       <w:r>
-        <w:t xml:space="preserve">Of roughly two dozen obligations, about eleven cannot be checked from outside at all.</w:t>
+        <w:t xml:space="preserve">Of twenty-four obligations, fourteen cannot be checked from outside at all.</w:t>
       </w:r>
     </w:p>
     <w:p>

</xml_diff>